<commit_message>
docx: inject cluster coordinator + AI narrative; fix trainees-v2 card flicker
D.2: (a) template coordinator cell was hard-coded (Charles Ochom) with no token —
replaced with {{coord.name/phone/email}}; programmedoc.ts COORDINATORS map fills them
per selected cluster (iganga=Francis, bugiri=Ojok, kamuli=Ruth). (b) added
{{narr.ai_summary}} paragraph to the Executive Summary; /api/programme-report/docx now
calls narrate() (Workers AI) server-side and injects real AI prose into the DOWNLOADED
docx, starting from the cluster coordinator line. Deterministic fallback on AI failure.
Template re-zipped (44 members preserved), output validated well-formed, 0 unfilled tokens.

D.2b: trainees-v2 KPI cards flickered because filter change-events fired overlapping
fetches that resolved out of order. Added request-sequence guard (_reqSeq), 180ms
debounce (scheduleLoad), no-store cache, and an 'updating…' spinner.
</commit_message>
<xml_diff>
--- a/public/static/programme_template.docx
+++ b/public/static/programme_template.docx
@@ -641,7 +641,7 @@
                 <w:sz w:val="24"/>
                 <w:szCs w:val="24"/>
               </w:rPr>
-              <w:t>Charles Ochom</w:t>
+              <w:t>{{coord.name}}</w:t>
             </w:r>
           </w:p>
         </w:tc>
@@ -751,7 +751,7 @@
                 <w:sz w:val="24"/>
                 <w:szCs w:val="24"/>
               </w:rPr>
-              <w:t>0772063030</w:t>
+              <w:t>{{coord.phone}}</w:t>
             </w:r>
           </w:p>
         </w:tc>
@@ -949,7 +949,7 @@
                 <w:sz w:val="24"/>
                 <w:szCs w:val="24"/>
               </w:rPr>
-              <w:t>Charles.Ochom@heifer.org</w:t>
+              <w:t>{{coord.email}}</w:t>
             </w:r>
           </w:p>
         </w:tc>
@@ -1461,6 +1461,27 @@
       <w:r/>
       <w:proofErr w:type="gramEnd"/>
       <w:r/>
+    </w:p>
+    <w:p>
+      <w:pPr>
+        <w:spacing w:after="120" w:line="276" w:lineRule="auto"/>
+        <w:jc w:val="both"/>
+        <w:rPr>
+          <w:rFonts w:ascii="Gill Sans MT" w:hAnsi="Gill Sans MT"/>
+          <w:color w:val="141413"/>
+          <w:sz w:val="24"/>
+          <w:szCs w:val="24"/>
+        </w:rPr>
+      </w:pPr>
+      <w:r>
+        <w:rPr>
+          <w:rFonts w:ascii="Gill Sans MT" w:hAnsi="Gill Sans MT"/>
+          <w:color w:val="141413"/>
+          <w:sz w:val="24"/>
+          <w:szCs w:val="24"/>
+        </w:rPr>
+        <w:t xml:space="preserve">{{narr.ai_summary}}</w:t>
+      </w:r>
     </w:p>
     <w:p>
       <w:pPr>

</xml_diff>